<commit_message>
Add macOS/Linux launchers; update R/Pandoc docs
Clarify R and Pandoc prerequisites across docs and start-up guides: recommend organization-approved R 4.2+, list one of three Pandoc providers (RStudio Desktop, Quarto, standalone Pandoc), and add macOS/Linux Start_Here command launchers and Gatekeeper guidance. Update release checklist and supported-platform notes to reflect managed-environment testing and Pandoc/provider requirements. Minor script tweak: build_clean_release README text updated. Robustness fix in scripts/eblupMFH2_robust.R rejects non-finite matrices before chol() and reports unavailable MSE terms to ensure consistent cross-platform behavior.
</commit_message>
<xml_diff>
--- a/docs/guidance/guidelines_v5_2_0_rc6_wizard.docx
+++ b/docs/guidance/guidelines_v5_2_0_rc6_wizard.docx
@@ -30481,7 +30481,7 @@
         <w:pStyle w:val="FirstParagraph"/>
       </w:pPr>
       <w:r>
-        <w:t xml:space="preserve">The software prerequisite is R version 4.2 or later; RStudio is not required. Both HTML and Word report generation require Pandoc, available separately or bundled with RStudio. Obtain the authorized, history-free 5.2.0-rc.6 wizard archive and verify release_manifest.csv before starting. Do not use a superseded tag, an automatic repository source archive, or a zip of the source workspace. The public release URL remains intentionally omitted until the documented history, rights, and institutional-release gates are closed.</w:t>
+        <w:t>Install R 4.2 or later from https://cran.r-project.org/. Use the newest R version that your organization has approved and made available; installing the absolute latest release is not required. For HTML and Word reports, install one free option: RStudio Desktop (https://posit.co/download/rstudio-desktop/), Quarto (https://quarto.org/docs/get-started/), or standalone Pandoc (https://pandoc.org/installing.html). RStudio is otherwise optional. Obtain the authorized, history-free 5.2.0-rc.6 wizard archive and verify release_manifest.csv before starting. Do not use a superseded tag, an automatic repository source archive, or a zip of the source workspace. The public release URL remains intentionally omitted until the documented history, rights, and institutional-release gates are closed.</w:t>
       </w:r>
     </w:p>
     <w:p>
@@ -30510,15 +30510,17 @@
       </w:r>
       <w:r>
         <w:br/>
-        <w:t xml:space="preserve">|-- Start_Here/Start_Wizard.bat    # Windows wizard</w:t>
+        <w:t>|-- Start_Here/Start_Wizard.bat     # Windows wizard</w:t>
       </w:r>
       <w:r>
         <w:br/>
-        <w:t xml:space="preserve">|-- Start_Here/Start_Dashboard.bat # Windows classic</w:t>
+        <w:t>|-- Start_Here/Start_Wizard.command # macOS/Linux wizard</w:t>
       </w:r>
       <w:r>
         <w:br/>
-        <w:t>|-- Start_Dashboard.sh    # classic macOS/Linux launcher</w:t>
+        <w:t>|-- Start_Here/Start_Dashboard.bat  # Windows classic</w:t>
+        <w:br/>
+        <w:t>|-- Start_Here/Start_Dashboard.command # macOS/Linux classic</w:t>
       </w:r>
       <w:r>
         <w:br/>
@@ -30554,7 +30556,7 @@
         <w:pStyle w:val="BodyText"/>
       </w:pPr>
       <w:r>
-        <w:t xml:space="preserve">On Windows, open Start_Here and double-click Start_Wizard.bat. On the first launch, the launcher checks the required R packages and installs missing or outdated dependencies. Later launches are normally faster. The launcher window must remain open while the wizard is in use. Select Get Started on the landing screen to enter the six-step setup.</w:t>
+        <w:t>After extracting the whole ZIP, open Start_Here. On Windows, double-click Start_Wizard.bat. On macOS, double-click Start_Wizard.command; if macOS blocks it, Control-click the file, choose Open, and confirm Open. On Linux, run bash Start_Here/Start_Wizard.command from a terminal. The first launch checks required R packages and installs missing or outdated dependencies, so it needs an internet connection and may take several minutes. Keep the launcher or Terminal window open while using the wizard. Select Get Started on the landing screen. See Start_Here/README.md for detailed macOS permission help.</w:t>
       </w:r>
     </w:p>
     <w:p>
@@ -36472,7 +36474,7 @@
         <w:ind w:left="480"/>
       </w:pPr>
       <w:r>
-        <w:t xml:space="preserve">☐ R 4.2 or later installed; packages installed via </w:t>
+        <w:t xml:space="preserve">☐ R 4.2 or later installed (newest organization-approved version); one report tool installed (RStudio Desktop, Quarto, or standalone Pandoc); packages installed via </w:t>
       </w:r>
       <w:r>
         <w:rPr>
@@ -36888,7 +36890,7 @@
         <w:t xml:space="preserve">Launch the Dashboard. </w:t>
       </w:r>
       <w:r>
-        <w:t xml:space="preserve">Double-click Start_Here/Start_Dashboard.bat (Windows) or Start_Dashboard.sh (macOS/Linux). On first launch, wait while packages install. When the cover screen appears, click Get Started to open the main workspace.</w:t>
+        <w:t>Double-click Start_Here/Start_Dashboard.bat (Windows) or Start_Here/Start_Dashboard.command (macOS). On Linux, run bash Start_Here/Start_Dashboard.command from a terminal. On first launch, wait while packages install. When the cover screen appears, click Get Started to open the main workspace.</w:t>
       </w:r>
     </w:p>
     <w:p>

</xml_diff>